<commit_message>
MP9 instructions: plug-in download for Revit 2020-2025 (v1.0.0 release page), and the year to use in the add-in folder and the prompt for another version
Co-Authored-By: Claude Opus 5.5 <noreply@anthropic.com>
</commit_message>
<xml_diff>
--- a/mp9_bim_agents/MP9_Student_Instructions_Revit_MCP.docx
+++ b/mp9_bim_agents/MP9_Student_Instructions_Revit_MCP.docx
@@ -183,7 +183,7 @@
               <w:t xml:space="preserve">Windows PC with Revit 2026</w:t>
             </w:r>
             <w:r>
-              <w:t xml:space="preserve">, on which you have administrator rights</w:t>
+              <w:t xml:space="preserve"> (2020–2025 also work), on which you have administrator rights</w:t>
             </w:r>
           </w:p>
         </w:tc>
@@ -204,7 +204,7 @@
             <w:r>
               <w:t xml:space="preserve">Free with an Autodesk Education account: </w:t>
             </w:r>
-            <w:hyperlink w:history="1" r:id="rIddnavto92z77r7pe5p1yo5">
+            <w:hyperlink w:history="1" r:id="rIdy67xafqvnj_hp-tlmwsbr">
               <w:r>
                 <w:rPr>
                   <w:color w:val="0563C1"/>
@@ -263,7 +263,7 @@
             <w:r>
               <w:t xml:space="preserve">Windows installer (Windows 10 or later): </w:t>
             </w:r>
-            <w:hyperlink w:history="1" r:id="rIdhthsgksuohlr6t1a1h7dl">
+            <w:hyperlink w:history="1" r:id="rIdimd9z2ctrn83j2vmexcbk">
               <w:r>
                 <w:rPr>
                   <w:color w:val="0563C1"/>
@@ -280,7 +280,7 @@
             <w:r>
               <w:t xml:space="preserve">Account: </w:t>
             </w:r>
-            <w:hyperlink w:history="1" r:id="rIded5sxegyvke289_rpakt7">
+            <w:hyperlink w:history="1" r:id="rId6htpqfnzjgt3gjnm7_8aw">
               <w:r>
                 <w:rPr>
                   <w:color w:val="0563C1"/>
@@ -342,7 +342,7 @@
             <w:r>
               <w:t xml:space="preserve">iPhone (iOS 18 or later): </w:t>
             </w:r>
-            <w:hyperlink w:history="1" r:id="rId7y7g0bndvmrdscbn7zudz">
+            <w:hyperlink w:history="1" r:id="rId5m155on-ikdwdkq7nlyul">
               <w:r>
                 <w:rPr>
                   <w:color w:val="0563C1"/>
@@ -359,7 +359,7 @@
             <w:r>
               <w:t xml:space="preserve">Android: </w:t>
             </w:r>
-            <w:hyperlink w:history="1" r:id="rIdriudl3imtqwjjclq1e4tg">
+            <w:hyperlink w:history="1" r:id="rIdzikiqd_z4seipsufjcdhg">
               <w:r>
                 <w:rPr>
                   <w:color w:val="0563C1"/>
@@ -376,7 +376,7 @@
             <w:r>
               <w:t xml:space="preserve">All versions: </w:t>
             </w:r>
-            <w:hyperlink w:history="1" r:id="rId07ch7hswnvlrfgag2nwcb">
+            <w:hyperlink w:history="1" r:id="rIdhk2v0urmyktwugidbh7g5">
               <w:r>
                 <w:rPr>
                   <w:color w:val="0563C1"/>
@@ -426,7 +426,7 @@
               <w:t xml:space="preserve">mcp-servers-for-revit</w:t>
             </w:r>
             <w:r>
-              <w:t xml:space="preserve">, Revit 2026 version)</w:t>
+              <w:t xml:space="preserve"> v1.0.0)</w:t>
             </w:r>
           </w:p>
         </w:tc>
@@ -445,7 +445,41 @@
               <w:spacing w:after="40"/>
             </w:pPr>
             <w:r>
-              <w:t xml:space="preserve">The zip file from your instructor. Do not use another download.</w:t>
+              <w:t xml:space="preserve">Revit 2026: the zip file from your instructor</w:t>
+            </w:r>
+          </w:p>
+          <w:p>
+            <w:pPr>
+              <w:spacing w:after="40"/>
+            </w:pPr>
+            <w:r>
+              <w:t xml:space="preserve">Revit 2020–2025: the zip file for your version (for example </w:t>
+            </w:r>
+            <w:r>
+              <w:rPr>
+                <w:rFonts w:ascii="Consolas" w:cs="Consolas" w:eastAsia="Consolas" w:hAnsi="Consolas"/>
+              </w:rPr>
+              <w:t xml:space="preserve">mcp-servers-for-revit-v1.0.0-Revit2025.zip</w:t>
+            </w:r>
+            <w:r>
+              <w:t xml:space="preserve">) from the </w:t>
+            </w:r>
+            <w:hyperlink w:history="1" r:id="rIdyocuc1crfk0ozyvwfjwzm">
+              <w:r>
+                <w:rPr>
+                  <w:color w:val="0563C1"/>
+                  <w:u w:val="single"/>
+                </w:rPr>
+                <w:t xml:space="preserve">v1.0.0 release page</w:t>
+              </w:r>
+            </w:hyperlink>
+          </w:p>
+          <w:p>
+            <w:pPr>
+              <w:spacing w:after="40"/>
+            </w:pPr>
+            <w:r>
+              <w:t xml:space="preserve">Do not use another download.</w:t>
             </w:r>
           </w:p>
         </w:tc>
@@ -547,7 +581,25 @@
         <w:t xml:space="preserve">ProgramData</w:t>
       </w:r>
       <w:r>
-        <w:t xml:space="preserve"> folder is hidden otherwise). Windows asks for administrator permission to copy into this folder.</w:t>
+        <w:t xml:space="preserve"> folder is hidden otherwise). Windows asks for administrator permission to copy into this folder. For another Revit version, use its year in place of </w:t>
+      </w:r>
+      <w:r>
+        <w:rPr>
+          <w:rFonts w:ascii="Consolas" w:cs="Consolas" w:eastAsia="Consolas" w:hAnsi="Consolas"/>
+        </w:rPr>
+        <w:t xml:space="preserve">2026</w:t>
+      </w:r>
+      <w:r>
+        <w:t xml:space="preserve"> (for example </w:t>
+      </w:r>
+      <w:r>
+        <w:rPr>
+          <w:rFonts w:ascii="Consolas" w:cs="Consolas" w:eastAsia="Consolas" w:hAnsi="Consolas"/>
+        </w:rPr>
+        <w:t xml:space="preserve">...\Addins\2025\</w:t>
+      </w:r>
+      <w:r>
+        <w:t xml:space="preserve">), here and in the initial prompt.</w:t>
       </w:r>
     </w:p>
     <w:p>

</xml_diff>